<commit_message>
Run_assessment_report 보  수 정 중
</commit_message>
<xml_diff>
--- a/report_agent/output/risk_assessment_report_template.docx
+++ b/report_agent/output/risk_assessment_report_template.docx
@@ -440,70 +440,7 @@
                 <w:sz w:val="22"/>
                 <w:lang w:eastAsia="ko-KR"/>
               </w:rPr>
-              <w:t>안전한</w:t>
-            </w:r>
-            <w:r>
-              <w:rPr>
-                <w:b/>
-                <w:color w:val="123B67"/>
-                <w:sz w:val="22"/>
-                <w:lang w:eastAsia="ko-KR"/>
-              </w:rPr>
-              <w:t xml:space="preserve"> </w:t>
-            </w:r>
-            <w:r>
-              <w:rPr>
-                <w:b/>
-                <w:color w:val="123B67"/>
-                <w:sz w:val="22"/>
-                <w:lang w:eastAsia="ko-KR"/>
-              </w:rPr>
-              <w:t>작업환경</w:t>
-            </w:r>
-            <w:r>
-              <w:rPr>
-                <w:b/>
-                <w:color w:val="123B67"/>
-                <w:sz w:val="22"/>
-                <w:lang w:eastAsia="ko-KR"/>
-              </w:rPr>
-              <w:t xml:space="preserve">, </w:t>
-            </w:r>
-            <w:r>
-              <w:rPr>
-                <w:b/>
-                <w:color w:val="123B67"/>
-                <w:sz w:val="22"/>
-                <w:lang w:eastAsia="ko-KR"/>
-              </w:rPr>
-              <w:t>데이터로</w:t>
-            </w:r>
-            <w:r>
-              <w:rPr>
-                <w:b/>
-                <w:color w:val="123B67"/>
-                <w:sz w:val="22"/>
-                <w:lang w:eastAsia="ko-KR"/>
-              </w:rPr>
-              <w:t xml:space="preserve"> </w:t>
-            </w:r>
-            <w:r>
-              <w:rPr>
-                <w:b/>
-                <w:color w:val="123B67"/>
-                <w:sz w:val="22"/>
-                <w:lang w:eastAsia="ko-KR"/>
-              </w:rPr>
-              <w:t>증명한다</w:t>
-            </w:r>
-            <w:r>
-              <w:rPr>
-                <w:b/>
-                <w:color w:val="123B67"/>
-                <w:sz w:val="22"/>
-                <w:lang w:eastAsia="ko-KR"/>
-              </w:rPr>
-              <w:t>.</w:t>
+              <w:t>안전한 작업환경, 데이터로 증명한다.</w:t>
             </w:r>
           </w:p>
           <w:p>
@@ -519,159 +456,7 @@
                 <w:sz w:val="18"/>
                 <w:lang w:eastAsia="ko-KR"/>
               </w:rPr>
-              <w:t>본</w:t>
-            </w:r>
-            <w:r>
-              <w:rPr>
-                <w:color w:val="6B7A8C"/>
-                <w:sz w:val="18"/>
-                <w:lang w:eastAsia="ko-KR"/>
-              </w:rPr>
-              <w:t xml:space="preserve"> </w:t>
-            </w:r>
-            <w:r>
-              <w:rPr>
-                <w:color w:val="6B7A8C"/>
-                <w:sz w:val="18"/>
-                <w:lang w:eastAsia="ko-KR"/>
-              </w:rPr>
-              <w:t>문서는</w:t>
-            </w:r>
-            <w:r>
-              <w:rPr>
-                <w:color w:val="6B7A8C"/>
-                <w:sz w:val="18"/>
-                <w:lang w:eastAsia="ko-KR"/>
-              </w:rPr>
-              <w:t xml:space="preserve"> AI </w:t>
-            </w:r>
-            <w:r>
-              <w:rPr>
-                <w:color w:val="6B7A8C"/>
-                <w:sz w:val="18"/>
-                <w:lang w:eastAsia="ko-KR"/>
-              </w:rPr>
-              <w:t>기반</w:t>
-            </w:r>
-            <w:r>
-              <w:rPr>
-                <w:color w:val="6B7A8C"/>
-                <w:sz w:val="18"/>
-                <w:lang w:eastAsia="ko-KR"/>
-              </w:rPr>
-              <w:t xml:space="preserve"> </w:t>
-            </w:r>
-            <w:r>
-              <w:rPr>
-                <w:color w:val="6B7A8C"/>
-                <w:sz w:val="18"/>
-                <w:lang w:eastAsia="ko-KR"/>
-              </w:rPr>
-              <w:t>위험성평가</w:t>
-            </w:r>
-            <w:r>
-              <w:rPr>
-                <w:color w:val="6B7A8C"/>
-                <w:sz w:val="18"/>
-                <w:lang w:eastAsia="ko-KR"/>
-              </w:rPr>
-              <w:t xml:space="preserve"> </w:t>
-            </w:r>
-            <w:r>
-              <w:rPr>
-                <w:color w:val="6B7A8C"/>
-                <w:sz w:val="18"/>
-                <w:lang w:eastAsia="ko-KR"/>
-              </w:rPr>
-              <w:t>데이터를</w:t>
-            </w:r>
-            <w:r>
-              <w:rPr>
-                <w:color w:val="6B7A8C"/>
-                <w:sz w:val="18"/>
-                <w:lang w:eastAsia="ko-KR"/>
-              </w:rPr>
-              <w:t xml:space="preserve"> </w:t>
-            </w:r>
-            <w:r>
-              <w:rPr>
-                <w:color w:val="6B7A8C"/>
-                <w:sz w:val="18"/>
-                <w:lang w:eastAsia="ko-KR"/>
-              </w:rPr>
-              <w:t>토대로</w:t>
-            </w:r>
-            <w:r>
-              <w:rPr>
-                <w:color w:val="6B7A8C"/>
-                <w:sz w:val="18"/>
-                <w:lang w:eastAsia="ko-KR"/>
-              </w:rPr>
-              <w:t xml:space="preserve"> </w:t>
-            </w:r>
-            <w:r>
-              <w:rPr>
-                <w:color w:val="6B7A8C"/>
-                <w:sz w:val="18"/>
-                <w:lang w:eastAsia="ko-KR"/>
-              </w:rPr>
-              <w:t>자동</w:t>
-            </w:r>
-            <w:r>
-              <w:rPr>
-                <w:color w:val="6B7A8C"/>
-                <w:sz w:val="18"/>
-                <w:lang w:eastAsia="ko-KR"/>
-              </w:rPr>
-              <w:t xml:space="preserve"> </w:t>
-            </w:r>
-            <w:r>
-              <w:rPr>
-                <w:color w:val="6B7A8C"/>
-                <w:sz w:val="18"/>
-                <w:lang w:eastAsia="ko-KR"/>
-              </w:rPr>
-              <w:t>생성되는</w:t>
-            </w:r>
-            <w:r>
-              <w:rPr>
-                <w:color w:val="6B7A8C"/>
-                <w:sz w:val="18"/>
-                <w:lang w:eastAsia="ko-KR"/>
-              </w:rPr>
-              <w:t xml:space="preserve"> </w:t>
-            </w:r>
-            <w:r>
-              <w:rPr>
-                <w:color w:val="6B7A8C"/>
-                <w:sz w:val="18"/>
-                <w:lang w:eastAsia="ko-KR"/>
-              </w:rPr>
-              <w:t>보고서</w:t>
-            </w:r>
-            <w:r>
-              <w:rPr>
-                <w:color w:val="6B7A8C"/>
-                <w:sz w:val="18"/>
-                <w:lang w:eastAsia="ko-KR"/>
-              </w:rPr>
-              <w:t xml:space="preserve"> </w:t>
-            </w:r>
-            <w:r>
-              <w:rPr>
-                <w:color w:val="6B7A8C"/>
-                <w:sz w:val="18"/>
-                <w:lang w:eastAsia="ko-KR"/>
-              </w:rPr>
-              <w:t>양식이다</w:t>
-            </w:r>
-            <w:r>
-              <w:rPr>
-                <w:color w:val="6B7A8C"/>
-                <w:sz w:val="18"/>
-                <w:lang w:eastAsia="ko-KR"/>
-              </w:rPr>
-              <w:t>.</w:t>
+              <w:t>본 문서는 AI 기반 위험성평가 데이터를 토대로 자동 생성되는 보고서 양식이다.</w:t>
             </w:r>
           </w:p>
         </w:tc>
@@ -809,31 +594,7 @@
           <w:color w:val="123B67"/>
           <w:sz w:val="24"/>
         </w:rPr>
-        <w:t>주요</w:t>
-      </w:r>
-      <w:r>
-        <w:rPr>
-          <w:b/>
-          <w:color w:val="123B67"/>
-          <w:sz w:val="24"/>
-        </w:rPr>
-        <w:t xml:space="preserve"> </w:t>
-      </w:r>
-      <w:r>
-        <w:rPr>
-          <w:b/>
-          <w:color w:val="123B67"/>
-          <w:sz w:val="24"/>
-        </w:rPr>
-        <w:t>지표</w:t>
-      </w:r>
-      <w:r>
-        <w:rPr>
-          <w:b/>
-          <w:color w:val="123B67"/>
-          <w:sz w:val="24"/>
-        </w:rPr>
-        <w:t xml:space="preserve"> (KPI)</w:t>
+        <w:t>주요 지표 (KPI)</w:t>
       </w:r>
     </w:p>
     <w:tbl>
@@ -879,39 +640,7 @@
                 <w:color w:val="6B7A8C"/>
                 <w:sz w:val="18"/>
               </w:rPr>
-              <w:t>총</w:t>
-            </w:r>
-            <w:r>
-              <w:rPr>
-                <w:b/>
-                <w:color w:val="6B7A8C"/>
-                <w:sz w:val="18"/>
-              </w:rPr>
-              <w:t xml:space="preserve"> </w:t>
-            </w:r>
-            <w:r>
-              <w:rPr>
-                <w:b/>
-                <w:color w:val="6B7A8C"/>
-                <w:sz w:val="18"/>
-              </w:rPr>
-              <w:t>평가</w:t>
-            </w:r>
-            <w:r>
-              <w:rPr>
-                <w:b/>
-                <w:color w:val="6B7A8C"/>
-                <w:sz w:val="18"/>
-              </w:rPr>
-              <w:t xml:space="preserve"> </w:t>
-            </w:r>
-            <w:r>
-              <w:rPr>
-                <w:b/>
-                <w:color w:val="6B7A8C"/>
-                <w:sz w:val="18"/>
-              </w:rPr>
-              <w:t>건수</w:t>
+              <w:t>총 평가 건수</w:t>
             </w:r>
           </w:p>
           <w:p>
@@ -924,15 +653,7 @@
                 <w:color w:val="2F6FB3"/>
                 <w:sz w:val="24"/>
               </w:rPr>
-              <w:t>{{aggregated_data.kpi.assessment_records}}</w:t>
-            </w:r>
-            <w:r>
-              <w:rPr>
-                <w:b/>
-                <w:color w:val="2F6FB3"/>
-                <w:sz w:val="24"/>
-              </w:rPr>
-              <w:t>건</w:t>
+              <w:t>{{aggregated_data.kpi.assessment_records}}건</w:t>
             </w:r>
           </w:p>
         </w:tc>
@@ -963,23 +684,7 @@
                 <w:color w:val="6B7A8C"/>
                 <w:sz w:val="18"/>
               </w:rPr>
-              <w:t>고위험</w:t>
-            </w:r>
-            <w:r>
-              <w:rPr>
-                <w:b/>
-                <w:color w:val="6B7A8C"/>
-                <w:sz w:val="18"/>
-              </w:rPr>
-              <w:t xml:space="preserve"> + </w:t>
-            </w:r>
-            <w:r>
-              <w:rPr>
-                <w:b/>
-                <w:color w:val="6B7A8C"/>
-                <w:sz w:val="18"/>
-              </w:rPr>
-              <w:t>중대위험</w:t>
+              <w:t>고위험 + 중대위험</w:t>
             </w:r>
           </w:p>
           <w:p>
@@ -992,15 +697,7 @@
                 <w:color w:val="D94841"/>
                 <w:sz w:val="24"/>
               </w:rPr>
-              <w:t>{{aggregated_data.kpi.high_or_critical_risk_records}}</w:t>
-            </w:r>
-            <w:r>
-              <w:rPr>
-                <w:b/>
-                <w:color w:val="D94841"/>
-                <w:sz w:val="24"/>
-              </w:rPr>
-              <w:t>건</w:t>
+              <w:t>{{aggregated_data.kpi.high_or_critical_risk_records}}건</w:t>
             </w:r>
           </w:p>
         </w:tc>
@@ -1031,23 +728,7 @@
                 <w:color w:val="6B7A8C"/>
                 <w:sz w:val="18"/>
               </w:rPr>
-              <w:t>조치</w:t>
-            </w:r>
-            <w:r>
-              <w:rPr>
-                <w:b/>
-                <w:color w:val="6B7A8C"/>
-                <w:sz w:val="18"/>
-              </w:rPr>
-              <w:t xml:space="preserve"> </w:t>
-            </w:r>
-            <w:r>
-              <w:rPr>
-                <w:b/>
-                <w:color w:val="6B7A8C"/>
-                <w:sz w:val="18"/>
-              </w:rPr>
-              <w:t>건수</w:t>
+              <w:t>조치 건수</w:t>
             </w:r>
           </w:p>
           <w:p>
@@ -1060,15 +741,7 @@
                 <w:color w:val="F28C28"/>
                 <w:sz w:val="24"/>
               </w:rPr>
-              <w:t>{{aggregated_data.kpi.action_total}}</w:t>
-            </w:r>
-            <w:r>
-              <w:rPr>
-                <w:b/>
-                <w:color w:val="F28C28"/>
-                <w:sz w:val="24"/>
-              </w:rPr>
-              <w:t>건</w:t>
+              <w:t>{{aggregated_data.kpi.action_total}}건</w:t>
             </w:r>
           </w:p>
         </w:tc>
@@ -1100,27 +773,13 @@
             </w:pPr>
             <w:r>
               <w:rPr>
+                <w:rFonts w:hint="eastAsia"/>
                 <w:b/>
                 <w:color w:val="6B7A8C"/>
                 <w:sz w:val="18"/>
+                <w:lang w:eastAsia="ko-KR"/>
               </w:rPr>
-              <w:t>조치</w:t>
-            </w:r>
-            <w:r>
-              <w:rPr>
-                <w:b/>
-                <w:color w:val="6B7A8C"/>
-                <w:sz w:val="18"/>
-              </w:rPr>
-              <w:t xml:space="preserve"> </w:t>
-            </w:r>
-            <w:r>
-              <w:rPr>
-                <w:b/>
-                <w:color w:val="6B7A8C"/>
-                <w:sz w:val="18"/>
-              </w:rPr>
-              <w:t>완료율</w:t>
+              <w:t>종사자 참여율</w:t>
             </w:r>
           </w:p>
           <w:p>
@@ -1133,7 +792,23 @@
                 <w:color w:val="2E9D62"/>
                 <w:sz w:val="24"/>
               </w:rPr>
-              <w:t>{{aggregated_data.kpi.action_completion_rate}}%</w:t>
+              <w:t>{{</w:t>
+            </w:r>
+            <w:r>
+              <w:rPr>
+                <w:b/>
+                <w:color w:val="2E9D62"/>
+                <w:sz w:val="24"/>
+              </w:rPr>
+              <w:t>aggregated_data.kpi.board_action_history_rate</w:t>
+            </w:r>
+            <w:r>
+              <w:rPr>
+                <w:b/>
+                <w:color w:val="2E9D62"/>
+                <w:sz w:val="24"/>
+              </w:rPr>
+              <w:t>}}%</w:t>
             </w:r>
           </w:p>
         </w:tc>
@@ -1164,23 +839,7 @@
                 <w:color w:val="6B7A8C"/>
                 <w:sz w:val="18"/>
               </w:rPr>
-              <w:t>승인</w:t>
-            </w:r>
-            <w:r>
-              <w:rPr>
-                <w:b/>
-                <w:color w:val="6B7A8C"/>
-                <w:sz w:val="18"/>
-              </w:rPr>
-              <w:t xml:space="preserve"> </w:t>
-            </w:r>
-            <w:r>
-              <w:rPr>
-                <w:b/>
-                <w:color w:val="6B7A8C"/>
-                <w:sz w:val="18"/>
-              </w:rPr>
-              <w:t>완료율</w:t>
+              <w:t>승인 완료율</w:t>
             </w:r>
           </w:p>
           <w:p>
@@ -1224,39 +883,7 @@
                 <w:color w:val="6B7A8C"/>
                 <w:sz w:val="18"/>
               </w:rPr>
-              <w:t>미조치</w:t>
-            </w:r>
-            <w:r>
-              <w:rPr>
-                <w:b/>
-                <w:color w:val="6B7A8C"/>
-                <w:sz w:val="18"/>
-              </w:rPr>
-              <w:t xml:space="preserve"> </w:t>
-            </w:r>
-            <w:r>
-              <w:rPr>
-                <w:b/>
-                <w:color w:val="6B7A8C"/>
-                <w:sz w:val="18"/>
-              </w:rPr>
-              <w:t>평가</w:t>
-            </w:r>
-            <w:r>
-              <w:rPr>
-                <w:b/>
-                <w:color w:val="6B7A8C"/>
-                <w:sz w:val="18"/>
-              </w:rPr>
-              <w:t xml:space="preserve"> </w:t>
-            </w:r>
-            <w:r>
-              <w:rPr>
-                <w:b/>
-                <w:color w:val="6B7A8C"/>
-                <w:sz w:val="18"/>
-              </w:rPr>
-              <w:t>건수</w:t>
+              <w:t>미조치 평가 건수</w:t>
             </w:r>
           </w:p>
           <w:p>
@@ -1269,15 +896,7 @@
                 <w:color w:val="D94841"/>
                 <w:sz w:val="24"/>
               </w:rPr>
-              <w:t>{{aggregated_data.kpi.unaddressed_assessment_records}}</w:t>
-            </w:r>
-            <w:r>
-              <w:rPr>
-                <w:b/>
-                <w:color w:val="D94841"/>
-                <w:sz w:val="24"/>
-              </w:rPr>
-              <w:t>건</w:t>
+              <w:t>{{aggregated_data.kpi.unaddressed_assessment_records}}건</w:t>
             </w:r>
           </w:p>
         </w:tc>
@@ -1296,135 +915,7 @@
           <w:sz w:val="16"/>
           <w:lang w:eastAsia="ko-KR"/>
         </w:rPr>
-        <w:t xml:space="preserve">※ KPI </w:t>
-      </w:r>
-      <w:r>
-        <w:rPr>
-          <w:color w:val="6B7A8C"/>
-          <w:sz w:val="16"/>
-          <w:lang w:eastAsia="ko-KR"/>
-        </w:rPr>
-        <w:t>값은</w:t>
-      </w:r>
-      <w:r>
-        <w:rPr>
-          <w:color w:val="6B7A8C"/>
-          <w:sz w:val="16"/>
-          <w:lang w:eastAsia="ko-KR"/>
-        </w:rPr>
-        <w:t xml:space="preserve"> </w:t>
-      </w:r>
-      <w:r>
-        <w:rPr>
-          <w:color w:val="6B7A8C"/>
-          <w:sz w:val="16"/>
-          <w:lang w:eastAsia="ko-KR"/>
-        </w:rPr>
-        <w:t>선택한</w:t>
-      </w:r>
-      <w:r>
-        <w:rPr>
-          <w:color w:val="6B7A8C"/>
-          <w:sz w:val="16"/>
-          <w:lang w:eastAsia="ko-KR"/>
-        </w:rPr>
-        <w:t xml:space="preserve"> </w:t>
-      </w:r>
-      <w:r>
-        <w:rPr>
-          <w:color w:val="6B7A8C"/>
-          <w:sz w:val="16"/>
-          <w:lang w:eastAsia="ko-KR"/>
-        </w:rPr>
-        <w:t>평가기간의</w:t>
-      </w:r>
-      <w:r>
-        <w:rPr>
-          <w:color w:val="6B7A8C"/>
-          <w:sz w:val="16"/>
-          <w:lang w:eastAsia="ko-KR"/>
-        </w:rPr>
-        <w:t xml:space="preserve"> </w:t>
-      </w:r>
-      <w:r>
-        <w:rPr>
-          <w:color w:val="6B7A8C"/>
-          <w:sz w:val="16"/>
-          <w:lang w:eastAsia="ko-KR"/>
-        </w:rPr>
-        <w:t>최신</w:t>
-      </w:r>
-      <w:r>
-        <w:rPr>
-          <w:color w:val="6B7A8C"/>
-          <w:sz w:val="16"/>
-          <w:lang w:eastAsia="ko-KR"/>
-        </w:rPr>
-        <w:t xml:space="preserve"> </w:t>
-      </w:r>
-      <w:r>
-        <w:rPr>
-          <w:color w:val="6B7A8C"/>
-          <w:sz w:val="16"/>
-          <w:lang w:eastAsia="ko-KR"/>
-        </w:rPr>
-        <w:t>데이터</w:t>
-      </w:r>
-      <w:r>
-        <w:rPr>
-          <w:color w:val="6B7A8C"/>
-          <w:sz w:val="16"/>
-          <w:lang w:eastAsia="ko-KR"/>
-        </w:rPr>
-        <w:t xml:space="preserve"> </w:t>
-      </w:r>
-      <w:r>
-        <w:rPr>
-          <w:color w:val="6B7A8C"/>
-          <w:sz w:val="16"/>
-          <w:lang w:eastAsia="ko-KR"/>
-        </w:rPr>
-        <w:t>기준으로</w:t>
-      </w:r>
-      <w:r>
-        <w:rPr>
-          <w:color w:val="6B7A8C"/>
-          <w:sz w:val="16"/>
-          <w:lang w:eastAsia="ko-KR"/>
-        </w:rPr>
-        <w:t xml:space="preserve"> </w:t>
-      </w:r>
-      <w:r>
-        <w:rPr>
-          <w:color w:val="6B7A8C"/>
-          <w:sz w:val="16"/>
-          <w:lang w:eastAsia="ko-KR"/>
-        </w:rPr>
-        <w:t>자동</w:t>
-      </w:r>
-      <w:r>
-        <w:rPr>
-          <w:color w:val="6B7A8C"/>
-          <w:sz w:val="16"/>
-          <w:lang w:eastAsia="ko-KR"/>
-        </w:rPr>
-        <w:t xml:space="preserve"> </w:t>
-      </w:r>
-      <w:r>
-        <w:rPr>
-          <w:color w:val="6B7A8C"/>
-          <w:sz w:val="16"/>
-          <w:lang w:eastAsia="ko-KR"/>
-        </w:rPr>
-        <w:t>산출됩니다</w:t>
-      </w:r>
-      <w:r>
-        <w:rPr>
-          <w:color w:val="6B7A8C"/>
-          <w:sz w:val="16"/>
-          <w:lang w:eastAsia="ko-KR"/>
-        </w:rPr>
-        <w:t>.</w:t>
+        <w:t>※ KPI 값은 선택한 평가기간의 최신 데이터 기준으로 자동 산출됩니다.</w:t>
       </w:r>
     </w:p>
     <w:p>
@@ -1502,52 +993,7 @@
                 <w:sz w:val="32"/>
                 <w:lang w:eastAsia="ko-KR"/>
               </w:rPr>
-              <w:t>위험도</w:t>
-            </w:r>
-            <w:r>
-              <w:rPr>
-                <w:b/>
-                <w:color w:val="123B67"/>
-                <w:sz w:val="32"/>
-                <w:lang w:eastAsia="ko-KR"/>
-              </w:rPr>
-              <w:t xml:space="preserve"> </w:t>
-            </w:r>
-            <w:r>
-              <w:rPr>
-                <w:b/>
-                <w:color w:val="123B67"/>
-                <w:sz w:val="32"/>
-                <w:lang w:eastAsia="ko-KR"/>
-              </w:rPr>
-              <w:t>분포</w:t>
-            </w:r>
-            <w:r>
-              <w:rPr>
-                <w:b/>
-                <w:color w:val="123B67"/>
-                <w:sz w:val="32"/>
-                <w:lang w:eastAsia="ko-KR"/>
-              </w:rPr>
-              <w:t xml:space="preserve"> </w:t>
-            </w:r>
-            <w:r>
-              <w:rPr>
-                <w:b/>
-                <w:color w:val="123B67"/>
-                <w:sz w:val="32"/>
-                <w:lang w:eastAsia="ko-KR"/>
-              </w:rPr>
-              <w:t>및</w:t>
-            </w:r>
-            <w:r>
-              <w:rPr>
-                <w:b/>
-                <w:color w:val="123B67"/>
-                <w:sz w:val="32"/>
-                <w:lang w:eastAsia="ko-KR"/>
-              </w:rPr>
-              <w:t xml:space="preserve"> </w:t>
+              <w:t xml:space="preserve">위험도 분포 및 </w:t>
             </w:r>
             <w:r>
               <w:rPr>
@@ -1648,15 +1094,7 @@
                 <w:color w:val="D94841"/>
                 <w:sz w:val="24"/>
               </w:rPr>
-              <w:t>{{aggregated_data.kpi.critical_risk_records}}</w:t>
-            </w:r>
-            <w:r>
-              <w:rPr>
-                <w:b/>
-                <w:color w:val="D94841"/>
-                <w:sz w:val="24"/>
-              </w:rPr>
-              <w:t>건</w:t>
+              <w:t>{{aggregated_data.kpi.critical_risk_records}}건</w:t>
             </w:r>
           </w:p>
         </w:tc>
@@ -1700,15 +1138,7 @@
                 <w:color w:val="F28C28"/>
                 <w:sz w:val="24"/>
               </w:rPr>
-              <w:t>{{aggregated_data.kpi.high_risk_records}}</w:t>
-            </w:r>
-            <w:r>
-              <w:rPr>
-                <w:b/>
-                <w:color w:val="F28C28"/>
-                <w:sz w:val="24"/>
-              </w:rPr>
-              <w:t>건</w:t>
+              <w:t>{{aggregated_data.kpi.high_risk_records}}건</w:t>
             </w:r>
           </w:p>
         </w:tc>
@@ -1752,15 +1182,7 @@
                 <w:color w:val="F4C542"/>
                 <w:sz w:val="24"/>
               </w:rPr>
-              <w:t>{{aggregated_data.kpi.medium_risk_records}}</w:t>
-            </w:r>
-            <w:r>
-              <w:rPr>
-                <w:b/>
-                <w:color w:val="F4C542"/>
-                <w:sz w:val="24"/>
-              </w:rPr>
-              <w:t>건</w:t>
+              <w:t>{{aggregated_data.kpi.medium_risk_records}}건</w:t>
             </w:r>
           </w:p>
         </w:tc>
@@ -1804,15 +1226,7 @@
                 <w:color w:val="2E9D62"/>
                 <w:sz w:val="24"/>
               </w:rPr>
-              <w:t>{{aggregated_data.kpi.low_risk_records}}</w:t>
-            </w:r>
-            <w:r>
-              <w:rPr>
-                <w:b/>
-                <w:color w:val="2E9D62"/>
-                <w:sz w:val="24"/>
-              </w:rPr>
-              <w:t>건</w:t>
+              <w:t>{{aggregated_data.kpi.low_risk_records}}건</w:t>
             </w:r>
           </w:p>
         </w:tc>
@@ -1826,39 +1240,7 @@
           <w:color w:val="123B67"/>
           <w:sz w:val="22"/>
         </w:rPr>
-        <w:t>관리</w:t>
-      </w:r>
-      <w:r>
-        <w:rPr>
-          <w:b/>
-          <w:color w:val="123B67"/>
-          <w:sz w:val="22"/>
-        </w:rPr>
-        <w:t xml:space="preserve"> </w:t>
-      </w:r>
-      <w:r>
-        <w:rPr>
-          <w:b/>
-          <w:color w:val="123B67"/>
-          <w:sz w:val="22"/>
-        </w:rPr>
-        <w:t>현황</w:t>
-      </w:r>
-      <w:r>
-        <w:rPr>
-          <w:b/>
-          <w:color w:val="123B67"/>
-          <w:sz w:val="22"/>
-        </w:rPr>
-        <w:t xml:space="preserve"> </w:t>
-      </w:r>
-      <w:r>
-        <w:rPr>
-          <w:b/>
-          <w:color w:val="123B67"/>
-          <w:sz w:val="22"/>
-        </w:rPr>
-        <w:t>요약</w:t>
+        <w:t>관리 현황 요약</w:t>
       </w:r>
     </w:p>
     <w:tbl>
@@ -1961,23 +1343,7 @@
                 <w:color w:val="123B67"/>
                 <w:sz w:val="32"/>
               </w:rPr>
-              <w:t>주요</w:t>
-            </w:r>
-            <w:r>
-              <w:rPr>
-                <w:b/>
-                <w:color w:val="123B67"/>
-                <w:sz w:val="32"/>
-              </w:rPr>
-              <w:t xml:space="preserve"> </w:t>
-            </w:r>
-            <w:r>
-              <w:rPr>
-                <w:b/>
-                <w:color w:val="123B67"/>
-                <w:sz w:val="32"/>
-              </w:rPr>
-              <w:t>고위험항목</w:t>
+              <w:t>주요 고위험항목</w:t>
             </w:r>
             <w:r>
               <w:rPr>
@@ -2002,23 +1368,7 @@
           <w:color w:val="123B67"/>
           <w:sz w:val="20"/>
         </w:rPr>
-        <w:t>선정</w:t>
-      </w:r>
-      <w:r>
-        <w:rPr>
-          <w:b/>
-          <w:color w:val="123B67"/>
-          <w:sz w:val="20"/>
-        </w:rPr>
-        <w:t xml:space="preserve"> </w:t>
-      </w:r>
-      <w:r>
-        <w:rPr>
-          <w:b/>
-          <w:color w:val="123B67"/>
-          <w:sz w:val="20"/>
-        </w:rPr>
-        <w:t>기준</w:t>
+        <w:t>선정 기준</w:t>
       </w:r>
     </w:p>
     <w:tbl>
@@ -2063,223 +1413,7 @@
                 <w:sz w:val="18"/>
                 <w:lang w:eastAsia="ko-KR"/>
               </w:rPr>
-              <w:t>중대위험</w:t>
-            </w:r>
-            <w:r>
-              <w:rPr>
-                <w:color w:val="6B7A8C"/>
-                <w:sz w:val="18"/>
-                <w:lang w:eastAsia="ko-KR"/>
-              </w:rPr>
-              <w:t xml:space="preserve"> </w:t>
-            </w:r>
-            <w:r>
-              <w:rPr>
-                <w:color w:val="6B7A8C"/>
-                <w:sz w:val="18"/>
-                <w:lang w:eastAsia="ko-KR"/>
-              </w:rPr>
-              <w:t>및</w:t>
-            </w:r>
-            <w:r>
-              <w:rPr>
-                <w:color w:val="6B7A8C"/>
-                <w:sz w:val="18"/>
-                <w:lang w:eastAsia="ko-KR"/>
-              </w:rPr>
-              <w:t xml:space="preserve"> </w:t>
-            </w:r>
-            <w:r>
-              <w:rPr>
-                <w:color w:val="6B7A8C"/>
-                <w:sz w:val="18"/>
-                <w:lang w:eastAsia="ko-KR"/>
-              </w:rPr>
-              <w:t>고위험</w:t>
-            </w:r>
-            <w:r>
-              <w:rPr>
-                <w:color w:val="6B7A8C"/>
-                <w:sz w:val="18"/>
-                <w:lang w:eastAsia="ko-KR"/>
-              </w:rPr>
-              <w:t xml:space="preserve"> </w:t>
-            </w:r>
-            <w:r>
-              <w:rPr>
-                <w:color w:val="6B7A8C"/>
-                <w:sz w:val="18"/>
-                <w:lang w:eastAsia="ko-KR"/>
-              </w:rPr>
-              <w:t>항목</w:t>
-            </w:r>
-            <w:r>
-              <w:rPr>
-                <w:color w:val="6B7A8C"/>
-                <w:sz w:val="18"/>
-                <w:lang w:eastAsia="ko-KR"/>
-              </w:rPr>
-              <w:t xml:space="preserve"> </w:t>
-            </w:r>
-            <w:r>
-              <w:rPr>
-                <w:color w:val="6B7A8C"/>
-                <w:sz w:val="18"/>
-                <w:lang w:eastAsia="ko-KR"/>
-              </w:rPr>
-              <w:t>중</w:t>
-            </w:r>
-            <w:r>
-              <w:rPr>
-                <w:color w:val="6B7A8C"/>
-                <w:sz w:val="18"/>
-                <w:lang w:eastAsia="ko-KR"/>
-              </w:rPr>
-              <w:t xml:space="preserve"> </w:t>
-            </w:r>
-            <w:r>
-              <w:rPr>
-                <w:color w:val="6B7A8C"/>
-                <w:sz w:val="18"/>
-                <w:lang w:eastAsia="ko-KR"/>
-              </w:rPr>
-              <w:t>조치</w:t>
-            </w:r>
-            <w:r>
-              <w:rPr>
-                <w:color w:val="6B7A8C"/>
-                <w:sz w:val="18"/>
-                <w:lang w:eastAsia="ko-KR"/>
-              </w:rPr>
-              <w:t xml:space="preserve"> </w:t>
-            </w:r>
-            <w:r>
-              <w:rPr>
-                <w:color w:val="6B7A8C"/>
-                <w:sz w:val="18"/>
-                <w:lang w:eastAsia="ko-KR"/>
-              </w:rPr>
-              <w:t>상태</w:t>
-            </w:r>
-            <w:r>
-              <w:rPr>
-                <w:color w:val="6B7A8C"/>
-                <w:sz w:val="18"/>
-                <w:lang w:eastAsia="ko-KR"/>
-              </w:rPr>
-              <w:t xml:space="preserve">, </w:t>
-            </w:r>
-            <w:r>
-              <w:rPr>
-                <w:color w:val="6B7A8C"/>
-                <w:sz w:val="18"/>
-                <w:lang w:eastAsia="ko-KR"/>
-              </w:rPr>
-              <w:t>승인</w:t>
-            </w:r>
-            <w:r>
-              <w:rPr>
-                <w:color w:val="6B7A8C"/>
-                <w:sz w:val="18"/>
-                <w:lang w:eastAsia="ko-KR"/>
-              </w:rPr>
-              <w:t xml:space="preserve"> </w:t>
-            </w:r>
-            <w:r>
-              <w:rPr>
-                <w:color w:val="6B7A8C"/>
-                <w:sz w:val="18"/>
-                <w:lang w:eastAsia="ko-KR"/>
-              </w:rPr>
-              <w:t>상태</w:t>
-            </w:r>
-            <w:r>
-              <w:rPr>
-                <w:color w:val="6B7A8C"/>
-                <w:sz w:val="18"/>
-                <w:lang w:eastAsia="ko-KR"/>
-              </w:rPr>
-              <w:t xml:space="preserve">, </w:t>
-            </w:r>
-            <w:r>
-              <w:rPr>
-                <w:color w:val="6B7A8C"/>
-                <w:sz w:val="18"/>
-                <w:lang w:eastAsia="ko-KR"/>
-              </w:rPr>
-              <w:t>노출</w:t>
-            </w:r>
-            <w:r>
-              <w:rPr>
-                <w:color w:val="6B7A8C"/>
-                <w:sz w:val="18"/>
-                <w:lang w:eastAsia="ko-KR"/>
-              </w:rPr>
-              <w:t xml:space="preserve"> </w:t>
-            </w:r>
-            <w:r>
-              <w:rPr>
-                <w:color w:val="6B7A8C"/>
-                <w:sz w:val="18"/>
-                <w:lang w:eastAsia="ko-KR"/>
-              </w:rPr>
-              <w:t>수준을</w:t>
-            </w:r>
-            <w:r>
-              <w:rPr>
-                <w:color w:val="6B7A8C"/>
-                <w:sz w:val="18"/>
-                <w:lang w:eastAsia="ko-KR"/>
-              </w:rPr>
-              <w:t xml:space="preserve"> </w:t>
-            </w:r>
-            <w:r>
-              <w:rPr>
-                <w:color w:val="6B7A8C"/>
-                <w:sz w:val="18"/>
-                <w:lang w:eastAsia="ko-KR"/>
-              </w:rPr>
-              <w:t>기준으로</w:t>
-            </w:r>
-            <w:r>
-              <w:rPr>
-                <w:color w:val="6B7A8C"/>
-                <w:sz w:val="18"/>
-                <w:lang w:eastAsia="ko-KR"/>
-              </w:rPr>
-              <w:t xml:space="preserve"> </w:t>
-            </w:r>
-            <w:r>
-              <w:rPr>
-                <w:color w:val="6B7A8C"/>
-                <w:sz w:val="18"/>
-                <w:lang w:eastAsia="ko-KR"/>
-              </w:rPr>
-              <w:t>우선</w:t>
-            </w:r>
-            <w:r>
-              <w:rPr>
-                <w:color w:val="6B7A8C"/>
-                <w:sz w:val="18"/>
-                <w:lang w:eastAsia="ko-KR"/>
-              </w:rPr>
-              <w:t xml:space="preserve"> </w:t>
-            </w:r>
-            <w:r>
-              <w:rPr>
-                <w:color w:val="6B7A8C"/>
-                <w:sz w:val="18"/>
-                <w:lang w:eastAsia="ko-KR"/>
-              </w:rPr>
-              <w:t>표시한다</w:t>
-            </w:r>
-            <w:r>
-              <w:rPr>
-                <w:color w:val="6B7A8C"/>
-                <w:sz w:val="18"/>
-                <w:lang w:eastAsia="ko-KR"/>
-              </w:rPr>
-              <w:t>.</w:t>
+              <w:t>중대위험 및 고위험 항목 중 조치 상태, 승인 상태, 노출 수준을 기준으로 우선 표시한다.</w:t>
             </w:r>
           </w:p>
         </w:tc>
@@ -2517,39 +1651,7 @@
                 <w:color w:val="FFFFFF"/>
                 <w:sz w:val="17"/>
               </w:rPr>
-              <w:t>점검</w:t>
-            </w:r>
-            <w:r>
-              <w:rPr>
-                <w:b/>
-                <w:color w:val="FFFFFF"/>
-                <w:sz w:val="17"/>
-              </w:rPr>
-              <w:t>·</w:t>
-            </w:r>
-            <w:r>
-              <w:rPr>
-                <w:b/>
-                <w:color w:val="FFFFFF"/>
-                <w:sz w:val="17"/>
-              </w:rPr>
-              <w:t>조치</w:t>
-            </w:r>
-            <w:r>
-              <w:rPr>
-                <w:b/>
-                <w:color w:val="FFFFFF"/>
-                <w:sz w:val="17"/>
-              </w:rPr>
-              <w:t xml:space="preserve"> </w:t>
-            </w:r>
-            <w:r>
-              <w:rPr>
-                <w:b/>
-                <w:color w:val="FFFFFF"/>
-                <w:sz w:val="17"/>
-              </w:rPr>
-              <w:t>내용</w:t>
+              <w:t>점검·조치 내용</w:t>
             </w:r>
           </w:p>
         </w:tc>
@@ -2698,13 +1800,7 @@
               <w:rPr>
                 <w:sz w:val="16"/>
               </w:rPr>
-              <w:t>{{aggregated_data.high_risk</w:t>
-            </w:r>
-            <w:r>
-              <w:rPr>
-                <w:sz w:val="16"/>
-              </w:rPr>
-              <w:t>_items.action_name}}</w:t>
+              <w:t>{{aggregated_data.high_risk_items.action_name}}</w:t>
             </w:r>
           </w:p>
         </w:tc>
@@ -2749,31 +1845,14 @@
               <w:rPr>
                 <w:sz w:val="16"/>
               </w:rPr>
-              <w:t>점검</w:t>
-            </w:r>
-            <w:r>
-              <w:rPr>
-                <w:sz w:val="16"/>
-              </w:rPr>
-              <w:t>: {{aggregated_data.high_risk_items.inspection_content}}</w:t>
+              <w:t>점검: {{aggregated_data.high_risk_items.inspection_content}}</w:t>
             </w:r>
             <w:r>
               <w:rPr>
                 <w:sz w:val="16"/>
               </w:rPr>
               <w:br/>
-            </w:r>
-            <w:r>
-              <w:rPr>
-                <w:sz w:val="16"/>
-              </w:rPr>
-              <w:t>조치</w:t>
-            </w:r>
-            <w:r>
-              <w:rPr>
-                <w:sz w:val="16"/>
-              </w:rPr>
-              <w:t>: {{aggregated_data.high_risk_items.action_content}}</w:t>
+              <w:t>조치: {{aggregated_data.high_risk_items.action_content}}</w:t>
             </w:r>
           </w:p>
         </w:tc>
@@ -2792,151 +1871,7 @@
           <w:sz w:val="16"/>
           <w:lang w:eastAsia="ko-KR"/>
         </w:rPr>
-        <w:t xml:space="preserve">※ </w:t>
-      </w:r>
-      <w:r>
-        <w:rPr>
-          <w:color w:val="6B7A8C"/>
-          <w:sz w:val="16"/>
-          <w:lang w:eastAsia="ko-KR"/>
-        </w:rPr>
-        <w:t>항목</w:t>
-      </w:r>
-      <w:r>
-        <w:rPr>
-          <w:color w:val="6B7A8C"/>
-          <w:sz w:val="16"/>
-          <w:lang w:eastAsia="ko-KR"/>
-        </w:rPr>
-        <w:t xml:space="preserve"> </w:t>
-      </w:r>
-      <w:r>
-        <w:rPr>
-          <w:color w:val="6B7A8C"/>
-          <w:sz w:val="16"/>
-          <w:lang w:eastAsia="ko-KR"/>
-        </w:rPr>
-        <w:t>수에</w:t>
-      </w:r>
-      <w:r>
-        <w:rPr>
-          <w:color w:val="6B7A8C"/>
-          <w:sz w:val="16"/>
-          <w:lang w:eastAsia="ko-KR"/>
-        </w:rPr>
-        <w:t xml:space="preserve"> </w:t>
-      </w:r>
-      <w:r>
-        <w:rPr>
-          <w:color w:val="6B7A8C"/>
-          <w:sz w:val="16"/>
-          <w:lang w:eastAsia="ko-KR"/>
-        </w:rPr>
-        <w:t>따라</w:t>
-      </w:r>
-      <w:r>
-        <w:rPr>
-          <w:color w:val="6B7A8C"/>
-          <w:sz w:val="16"/>
-          <w:lang w:eastAsia="ko-KR"/>
-        </w:rPr>
-        <w:t xml:space="preserve"> </w:t>
-      </w:r>
-      <w:r>
-        <w:rPr>
-          <w:color w:val="6B7A8C"/>
-          <w:sz w:val="16"/>
-          <w:lang w:eastAsia="ko-KR"/>
-        </w:rPr>
-        <w:t>표의</w:t>
-      </w:r>
-      <w:r>
-        <w:rPr>
-          <w:color w:val="6B7A8C"/>
-          <w:sz w:val="16"/>
-          <w:lang w:eastAsia="ko-KR"/>
-        </w:rPr>
-        <w:t xml:space="preserve"> </w:t>
-      </w:r>
-      <w:r>
-        <w:rPr>
-          <w:color w:val="6B7A8C"/>
-          <w:sz w:val="16"/>
-          <w:lang w:eastAsia="ko-KR"/>
-        </w:rPr>
-        <w:t>행과</w:t>
-      </w:r>
-      <w:r>
-        <w:rPr>
-          <w:color w:val="6B7A8C"/>
-          <w:sz w:val="16"/>
-          <w:lang w:eastAsia="ko-KR"/>
-        </w:rPr>
-        <w:t xml:space="preserve"> </w:t>
-      </w:r>
-      <w:r>
-        <w:rPr>
-          <w:color w:val="6B7A8C"/>
-          <w:sz w:val="16"/>
-          <w:lang w:eastAsia="ko-KR"/>
-        </w:rPr>
-        <w:t>페이지가</w:t>
-      </w:r>
-      <w:r>
-        <w:rPr>
-          <w:color w:val="6B7A8C"/>
-          <w:sz w:val="16"/>
-          <w:lang w:eastAsia="ko-KR"/>
-        </w:rPr>
-        <w:t xml:space="preserve"> </w:t>
-      </w:r>
-      <w:r>
-        <w:rPr>
-          <w:color w:val="6B7A8C"/>
-          <w:sz w:val="16"/>
-          <w:lang w:eastAsia="ko-KR"/>
-        </w:rPr>
-        <w:t>자동</w:t>
-      </w:r>
-      <w:r>
-        <w:rPr>
-          <w:color w:val="6B7A8C"/>
-          <w:sz w:val="16"/>
-          <w:lang w:eastAsia="ko-KR"/>
-        </w:rPr>
-        <w:t xml:space="preserve"> </w:t>
-      </w:r>
-      <w:r>
-        <w:rPr>
-          <w:color w:val="6B7A8C"/>
-          <w:sz w:val="16"/>
-          <w:lang w:eastAsia="ko-KR"/>
-        </w:rPr>
-        <w:t>확장되도록</w:t>
-      </w:r>
-      <w:r>
-        <w:rPr>
-          <w:color w:val="6B7A8C"/>
-          <w:sz w:val="16"/>
-          <w:lang w:eastAsia="ko-KR"/>
-        </w:rPr>
-        <w:t xml:space="preserve"> </w:t>
-      </w:r>
-      <w:r>
-        <w:rPr>
-          <w:color w:val="6B7A8C"/>
-          <w:sz w:val="16"/>
-          <w:lang w:eastAsia="ko-KR"/>
-        </w:rPr>
-        <w:t>구성합니다</w:t>
-      </w:r>
-      <w:r>
-        <w:rPr>
-          <w:color w:val="6B7A8C"/>
-          <w:sz w:val="16"/>
-          <w:lang w:eastAsia="ko-KR"/>
-        </w:rPr>
-        <w:t>.</w:t>
+        <w:t>※ 항목 수에 따라 표의 행과 페이지가 자동 확장되도록 구성합니다.</w:t>
       </w:r>
     </w:p>
     <w:p>
@@ -3075,23 +2010,7 @@
           <w:color w:val="123B67"/>
           <w:sz w:val="22"/>
         </w:rPr>
-        <w:t>핵심</w:t>
-      </w:r>
-      <w:r>
-        <w:rPr>
-          <w:b/>
-          <w:color w:val="123B67"/>
-          <w:sz w:val="22"/>
-        </w:rPr>
-        <w:t xml:space="preserve"> </w:t>
-      </w:r>
-      <w:r>
-        <w:rPr>
-          <w:b/>
-          <w:color w:val="123B67"/>
-          <w:sz w:val="22"/>
-        </w:rPr>
-        <w:t>확인사항</w:t>
+        <w:t>핵심 확인사항</w:t>
       </w:r>
     </w:p>
     <w:tbl>
@@ -3132,23 +2051,7 @@
                 <w:color w:val="123B67"/>
                 <w:sz w:val="18"/>
               </w:rPr>
-              <w:t>고위험</w:t>
-            </w:r>
-            <w:r>
-              <w:rPr>
-                <w:b/>
-                <w:color w:val="123B67"/>
-                <w:sz w:val="18"/>
-              </w:rPr>
-              <w:t xml:space="preserve"> </w:t>
-            </w:r>
-            <w:r>
-              <w:rPr>
-                <w:b/>
-                <w:color w:val="123B67"/>
-                <w:sz w:val="18"/>
-              </w:rPr>
-              <w:t>미조치</w:t>
+              <w:t>고위험 미조치</w:t>
             </w:r>
           </w:p>
         </w:tc>
@@ -3178,14 +2081,7 @@
                 <w:b/>
                 <w:sz w:val="20"/>
               </w:rPr>
-              <w:t>{{aggregated_data.kpi.unaddressed_high_risk_records}}</w:t>
-            </w:r>
-            <w:r>
-              <w:rPr>
-                <w:b/>
-                <w:sz w:val="20"/>
-              </w:rPr>
-              <w:t>건</w:t>
+              <w:t>{{aggregated_data.kpi.unaddressed_high_risk_records}}건</w:t>
             </w:r>
           </w:p>
         </w:tc>
@@ -3218,23 +2114,7 @@
                 <w:color w:val="123B67"/>
                 <w:sz w:val="18"/>
               </w:rPr>
-              <w:t>조치</w:t>
-            </w:r>
-            <w:r>
-              <w:rPr>
-                <w:b/>
-                <w:color w:val="123B67"/>
-                <w:sz w:val="18"/>
-              </w:rPr>
-              <w:t xml:space="preserve"> </w:t>
-            </w:r>
-            <w:r>
-              <w:rPr>
-                <w:b/>
-                <w:color w:val="123B67"/>
-                <w:sz w:val="18"/>
-              </w:rPr>
-              <w:t>완료율</w:t>
+              <w:t>조치 완료율</w:t>
             </w:r>
           </w:p>
         </w:tc>
@@ -3297,23 +2177,7 @@
                 <w:color w:val="123B67"/>
                 <w:sz w:val="18"/>
               </w:rPr>
-              <w:t>승인</w:t>
-            </w:r>
-            <w:r>
-              <w:rPr>
-                <w:b/>
-                <w:color w:val="123B67"/>
-                <w:sz w:val="18"/>
-              </w:rPr>
-              <w:t xml:space="preserve"> </w:t>
-            </w:r>
-            <w:r>
-              <w:rPr>
-                <w:b/>
-                <w:color w:val="123B67"/>
-                <w:sz w:val="18"/>
-              </w:rPr>
-              <w:t>완료율</w:t>
+              <w:t>승인 완료율</w:t>
             </w:r>
           </w:p>
         </w:tc>
@@ -3363,143 +2227,7 @@
           <w:sz w:val="17"/>
           <w:lang w:eastAsia="ko-KR"/>
         </w:rPr>
-        <w:t>본</w:t>
-      </w:r>
-      <w:r>
-        <w:rPr>
-          <w:color w:val="6B7A8C"/>
-          <w:sz w:val="17"/>
-          <w:lang w:eastAsia="ko-KR"/>
-        </w:rPr>
-        <w:t xml:space="preserve"> </w:t>
-      </w:r>
-      <w:r>
-        <w:rPr>
-          <w:color w:val="6B7A8C"/>
-          <w:sz w:val="17"/>
-          <w:lang w:eastAsia="ko-KR"/>
-        </w:rPr>
-        <w:t>보고서는</w:t>
-      </w:r>
-      <w:r>
-        <w:rPr>
-          <w:color w:val="6B7A8C"/>
-          <w:sz w:val="17"/>
-          <w:lang w:eastAsia="ko-KR"/>
-        </w:rPr>
-        <w:t xml:space="preserve"> </w:t>
-      </w:r>
-      <w:r>
-        <w:rPr>
-          <w:color w:val="6B7A8C"/>
-          <w:sz w:val="17"/>
-          <w:lang w:eastAsia="ko-KR"/>
-        </w:rPr>
-        <w:t>위험성평가</w:t>
-      </w:r>
-      <w:r>
-        <w:rPr>
-          <w:color w:val="6B7A8C"/>
-          <w:sz w:val="17"/>
-          <w:lang w:eastAsia="ko-KR"/>
-        </w:rPr>
-        <w:t xml:space="preserve"> </w:t>
-      </w:r>
-      <w:r>
-        <w:rPr>
-          <w:color w:val="6B7A8C"/>
-          <w:sz w:val="17"/>
-          <w:lang w:eastAsia="ko-KR"/>
-        </w:rPr>
-        <w:t>원본</w:t>
-      </w:r>
-      <w:r>
-        <w:rPr>
-          <w:color w:val="6B7A8C"/>
-          <w:sz w:val="17"/>
-          <w:lang w:eastAsia="ko-KR"/>
-        </w:rPr>
-        <w:t xml:space="preserve"> </w:t>
-      </w:r>
-      <w:r>
-        <w:rPr>
-          <w:color w:val="6B7A8C"/>
-          <w:sz w:val="17"/>
-          <w:lang w:eastAsia="ko-KR"/>
-        </w:rPr>
-        <w:t>데이터와</w:t>
-      </w:r>
-      <w:r>
-        <w:rPr>
-          <w:color w:val="6B7A8C"/>
-          <w:sz w:val="17"/>
-          <w:lang w:eastAsia="ko-KR"/>
-        </w:rPr>
-        <w:t xml:space="preserve"> </w:t>
-      </w:r>
-      <w:r>
-        <w:rPr>
-          <w:color w:val="6B7A8C"/>
-          <w:sz w:val="17"/>
-          <w:lang w:eastAsia="ko-KR"/>
-        </w:rPr>
-        <w:t>조치이력을</w:t>
-      </w:r>
-      <w:r>
-        <w:rPr>
-          <w:color w:val="6B7A8C"/>
-          <w:sz w:val="17"/>
-          <w:lang w:eastAsia="ko-KR"/>
-        </w:rPr>
-        <w:t xml:space="preserve"> </w:t>
-      </w:r>
-      <w:r>
-        <w:rPr>
-          <w:color w:val="6B7A8C"/>
-          <w:sz w:val="17"/>
-          <w:lang w:eastAsia="ko-KR"/>
-        </w:rPr>
-        <w:t>기반으로</w:t>
-      </w:r>
-      <w:r>
-        <w:rPr>
-          <w:color w:val="6B7A8C"/>
-          <w:sz w:val="17"/>
-          <w:lang w:eastAsia="ko-KR"/>
-        </w:rPr>
-        <w:t xml:space="preserve"> </w:t>
-      </w:r>
-      <w:r>
-        <w:rPr>
-          <w:color w:val="6B7A8C"/>
-          <w:sz w:val="17"/>
-          <w:lang w:eastAsia="ko-KR"/>
-        </w:rPr>
-        <w:t>자동</w:t>
-      </w:r>
-      <w:r>
-        <w:rPr>
-          <w:color w:val="6B7A8C"/>
-          <w:sz w:val="17"/>
-          <w:lang w:eastAsia="ko-KR"/>
-        </w:rPr>
-        <w:t xml:space="preserve"> </w:t>
-      </w:r>
-      <w:r>
-        <w:rPr>
-          <w:color w:val="6B7A8C"/>
-          <w:sz w:val="17"/>
-          <w:lang w:eastAsia="ko-KR"/>
-        </w:rPr>
-        <w:t>생성됩니다</w:t>
-      </w:r>
-      <w:r>
-        <w:rPr>
-          <w:color w:val="6B7A8C"/>
-          <w:sz w:val="17"/>
-          <w:lang w:eastAsia="ko-KR"/>
-        </w:rPr>
-        <w:t>.</w:t>
+        <w:t>본 보고서는 위험성평가 원본 데이터와 조치이력을 기반으로 자동 생성됩니다.</w:t>
       </w:r>
     </w:p>
     <w:sectPr>
@@ -4089,11 +2817,6 @@
     <w:lsdException w:name="Book Title" w:uiPriority="33" w:qFormat="1"/>
     <w:lsdException w:name="Bibliography" w:semiHidden="1" w:uiPriority="37" w:unhideWhenUsed="1"/>
     <w:lsdException w:name="TOC Heading" w:semiHidden="1" w:uiPriority="39" w:unhideWhenUsed="1" w:qFormat="1"/>
-    <w:lsdException w:name="Plain Table 5" w:semiHidden="1" w:unhideWhenUsed="1"/>
-    <w:lsdException w:name="Grid Table Light" w:semiHidden="1" w:unhideWhenUsed="1"/>
-    <w:lsdException w:name="Grid Table 1 Light" w:semiHidden="1" w:unhideWhenUsed="1"/>
-    <w:lsdException w:name="Grid Table 2" w:semiHidden="1" w:unhideWhenUsed="1"/>
-    <w:lsdException w:name="Grid Table 3" w:semiHidden="1" w:unhideWhenUsed="1"/>
     <w:lsdException w:name="Grid Table 4" w:uiPriority="49"/>
     <w:lsdException w:name="Grid Table 5 Dark" w:uiPriority="50"/>
     <w:lsdException w:name="Grid Table 6 Colorful" w:uiPriority="51"/>
@@ -4417,6 +3140,7 @@
   <w:style w:type="character" w:default="1" w:styleId="a2">
     <w:name w:val="Default Paragraph Font"/>
     <w:uiPriority w:val="1"/>
+    <w:semiHidden/>
     <w:unhideWhenUsed/>
   </w:style>
   <w:style w:type="table" w:default="1" w:styleId="a3">

</xml_diff>